<commit_message>
Fix thesis layout issues, resolve blank page overflows, and compile PDF/DOCX documents
</commit_message>
<xml_diff>
--- a/graduation_thesis/BorsaNeuron_Graduation_Thesis_v3.docx
+++ b/graduation_thesis/BorsaNeuron_Graduation_Thesis_v3.docx
@@ -60,7 +60,6 @@
           <w:rFonts w:ascii="Times New Roman" w:hAnsi="Times New Roman"/>
           <w:sz w:val="24"/>
         </w:rPr>
-        <w:t>&lt;br&gt;&lt;br&gt;</w:t>
       </w:r>
     </w:p>
     <w:p/>
@@ -100,7 +99,6 @@
           <w:rFonts w:ascii="Times New Roman" w:hAnsi="Times New Roman"/>
           <w:sz w:val="24"/>
         </w:rPr>
-        <w:t>&lt;br&gt;&lt;br&gt;</w:t>
       </w:r>
     </w:p>
     <w:p/>
@@ -166,7 +164,6 @@
           <w:rFonts w:ascii="Times New Roman" w:hAnsi="Times New Roman"/>
           <w:sz w:val="24"/>
         </w:rPr>
-        <w:t>&lt;br&gt;&lt;br&gt;</w:t>
       </w:r>
     </w:p>
     <w:p/>
@@ -193,7 +190,6 @@
           <w:rFonts w:ascii="Times New Roman" w:hAnsi="Times New Roman"/>
           <w:sz w:val="24"/>
         </w:rPr>
-        <w:t>&lt;br&gt;&lt;br&gt;</w:t>
       </w:r>
     </w:p>
     <w:p/>
@@ -216,7 +212,6 @@
         <w:br w:type="page"/>
       </w:r>
     </w:p>
-    <w:p/>
     <w:p>
       <w:pPr>
         <w:pStyle w:val="Heading2"/>
@@ -233,7 +228,6 @@
         <w:t>CONTENTS</w:t>
       </w:r>
     </w:p>
-    <w:p/>
     <w:p>
       <w:pPr>
         <w:spacing w:line="360" w:lineRule="auto" w:after="160"/>
@@ -650,7 +644,6 @@
         <w:t>REFERENCES 41</w:t>
       </w:r>
     </w:p>
-    <w:p/>
     <w:p>
       <w:pPr>
         <w:spacing w:line="360" w:lineRule="auto" w:after="160"/>
@@ -664,7 +657,6 @@
         <w:t>---</w:t>
       </w:r>
     </w:p>
-    <w:p/>
     <w:p>
       <w:pPr>
         <w:pStyle w:val="Heading2"/>
@@ -681,7 +673,6 @@
         <w:t>ÖZ</w:t>
       </w:r>
     </w:p>
-    <w:p/>
     <w:p>
       <w:pPr>
         <w:spacing w:line="360" w:lineRule="auto" w:after="160"/>
@@ -710,7 +701,6 @@
         <w:t>'u sunmaktadır.</w:t>
       </w:r>
     </w:p>
-    <w:p/>
     <w:p>
       <w:pPr>
         <w:spacing w:line="360" w:lineRule="auto" w:after="160"/>
@@ -739,7 +729,6 @@
         <w:t xml:space="preserve"> ait tarihsel günlük veriler üzerinde yürütülmüştür. Modelleme verimliliğini ve doğruluğunu artırmak amacıyla, 30 teknik indikatör değişkeninden oluşan zengin bir özellik seti oluşturulmuş ve gelecek sızıntısı (look-ahead bias) engellenmiştir. Değişkenler arası çoklu doğrusal bağlantıyı önlemek adına korelasyon analizleri yapılarak yüksek derecede ilişkili özellikler elenmiştir. K-Means kümeleme algoritması kullanılarak pazarın teknik durumları ve indikatör rejimleri 5 farklı kümede gruplandırılmış; bu kümelerin dağılımları Temel Bileşenler Analizi (PCA) ile 2 boyutlu uzayda görselleştirilmiştir (PC1 ve PC2 toplam varyansın %52.25'ini açıklamaktadır).</w:t>
       </w:r>
     </w:p>
-    <w:p/>
     <w:p>
       <w:pPr>
         <w:spacing w:line="360" w:lineRule="auto" w:after="160"/>
@@ -767,7 +756,6 @@
         <w:t>) tahmin etmek üzere K-En Yakın Komşu (K-NN), Yapay Sinir Ağları (ANN - MLPClassifier), Rastgele Orman (Random Forest) ve XGBoost modelleri eğitilmiştir. Yapay Sinir Ağı (ANN) %55.68 doğruluk ve 0.6496 F1-Skor ile en yüksek tahminsel başarıyı sergilerken; genişletilmiş veri setinde eğitilen XGBoost modeli dengeli duyarlılık ve kesinlik metrikleriyle online tahmin motoru olarak seçilmiştir.</w:t>
       </w:r>
     </w:p>
-    <w:p/>
     <w:p>
       <w:pPr>
         <w:spacing w:line="360" w:lineRule="auto" w:after="160"/>
@@ -810,7 +798,6 @@
         <w:t xml:space="preserve"> karar alma sürecine ağırlık olarak entegre ettiği ve TOBO, Fincan-Kulp, Flama, İkili Dip ve İkili Tepe gibi klasik formasyonları BIST genelinde tarayabildiği canlı bir platform sunmaktadır. Geliştirilen platform, Dockerfile ile konteynerleştirilmiş ve bulut ortamında yayına hazır hale getirilmiştir. GitHub dosya boyutu limitlerini aşmak amacıyla 318MB boyutundaki veri seti, xz formatında sıkıştırılarak 50.1MB'a düşürülmüş ve çalışma zamanında dinamik olarak okunacak şekilde entegre edilmiştir.</w:t>
       </w:r>
     </w:p>
-    <w:p/>
     <w:p>
       <w:pPr>
         <w:spacing w:line="360" w:lineRule="auto" w:after="160"/>
@@ -832,8 +819,6 @@
         <w:t xml:space="preserve"> Veri Madenciliği, BIST Tahminlemesi, Makine Öğrenmesi, K-Means Kümeleme, Sektörel Kıyaslama, Streamlit, Teknik Formasyon Tarayıcı.</w:t>
       </w:r>
     </w:p>
-    <w:p/>
-    <w:p/>
     <w:p>
       <w:pPr>
         <w:pStyle w:val="Heading1"/>
@@ -850,7 +835,6 @@
         <w:t>1. INTRODUCTION</w:t>
       </w:r>
     </w:p>
-    <w:p/>
     <w:p>
       <w:pPr>
         <w:spacing w:line="360" w:lineRule="auto" w:after="160"/>
@@ -879,7 +863,6 @@
         <w:t>, a holistic decision support and analytics platform aimed at forecasting 5-day future stock price directions and automating classical chart pattern scanning in the Borsa Istanbul (BIST) stock market using technical analysis indicators and machine learning algorithms.</w:t>
       </w:r>
     </w:p>
-    <w:p/>
     <w:p>
       <w:pPr>
         <w:spacing w:line="360" w:lineRule="auto" w:after="160"/>
@@ -908,7 +891,6 @@
         <w:t xml:space="preserve"> traded on Borsa Istanbul. Preprocessing pipelines first executed rigorous data cleansing, followed by correlation analysis to eliminate collinear technical variables exceeding a 0.90 threshold. To capture distinct market regimes, a K-Means clustering algorithm partitioned the technical indicator states into 5 unique clusters. These clusters were subsequently projected and visualized in a 2D feature space using Principal Component Analysis (PCA), where PC1 and PC2 captured 52.25% of the cumulative variance.</w:t>
       </w:r>
     </w:p>
-    <w:p/>
     <w:p>
       <w:pPr>
         <w:spacing w:line="360" w:lineRule="auto" w:after="160"/>
@@ -936,7 +918,6 @@
         <w:t>), K-Nearest Neighbors (K-NN), Artificial Neural Networks (ANN - MLPClassifier), and Random Forest (RF) classifiers were optimized. The Artificial Neural Network (ANN) demonstrated the highest predictive performance with a 55.68% accuracy and a 0.6496 F1-Score. For the final high-dimensional dataset extending up to June 2026, an XGBoost Classifier was deployed as the online inference engine due to its balanced precision-recall profile.</w:t>
       </w:r>
     </w:p>
-    <w:p/>
     <w:p>
       <w:pPr>
         <w:spacing w:line="360" w:lineRule="auto" w:after="160"/>
@@ -979,7 +960,6 @@
         <w:t>, and trigger automated scans to identify geometric chart formations such as Head and Shoulders (TOBO), Cup and Handle, Flag, Double Bottom, and Double Top formations. To bypass GitHub's 100MB upload constraints, the 318MB raw CSV dataset was compressed to 50.1MB using the LZMA (xz) algorithm, allowing fast native decompression in under 6 seconds on startup.</w:t>
       </w:r>
     </w:p>
-    <w:p/>
     <w:p>
       <w:pPr>
         <w:spacing w:line="360" w:lineRule="auto" w:after="160"/>
@@ -1001,7 +981,6 @@
         <w:t xml:space="preserve"> Data Mining, BIST Forecasting, Machine Learning, K-Means Clustering, Sector Peer Analysis, Streamlit, Technical Pattern Scanner.</w:t>
       </w:r>
     </w:p>
-    <w:p/>
     <w:p>
       <w:pPr>
         <w:spacing w:line="360" w:lineRule="auto" w:after="160"/>
@@ -1015,7 +994,6 @@
         <w:t>---</w:t>
       </w:r>
     </w:p>
-    <w:p/>
     <w:p>
       <w:r>
         <w:br w:type="page"/>
@@ -1037,7 +1015,6 @@
         <w:t>2. SETTING UP PROJECT</w:t>
       </w:r>
     </w:p>
-    <w:p/>
     <w:p>
       <w:pPr>
         <w:spacing w:line="360" w:lineRule="auto" w:after="160"/>
@@ -1051,7 +1028,6 @@
         <w:t>In the project, first of all, we need to install the relevant software and libraries that provide a quantitative development environment on our local computer. These tools provide us with a shell to run modeling scripts, train classifiers, and boot the web dashboard. After preparing the environment, we will install the packages from our terminal.</w:t>
       </w:r>
     </w:p>
-    <w:p/>
     <w:p>
       <w:pPr>
         <w:pStyle w:val="Heading2"/>
@@ -1144,7 +1120,6 @@
         <w:t xml:space="preserve"> Implemented locally to version-control the source scripts and configure continuous integration workflows.</w:t>
       </w:r>
     </w:p>
-    <w:p/>
     <w:p>
       <w:pPr>
         <w:pStyle w:val="Heading2"/>
@@ -1188,7 +1163,6 @@
         <w:t>:</w:t>
       </w:r>
     </w:p>
-    <w:p/>
     <w:p>
       <w:pPr>
         <w:spacing w:before="0" w:after="0"/>
@@ -1339,7 +1313,6 @@
         <w:t>xgboost&gt;=1.6.0</w:t>
       </w:r>
     </w:p>
-    <w:p/>
     <w:p>
       <w:pPr>
         <w:spacing w:line="360" w:lineRule="auto" w:after="160"/>
@@ -1353,7 +1326,6 @@
         <w:t>The environment is configured and launched via:</w:t>
       </w:r>
     </w:p>
-    <w:p/>
     <w:p>
       <w:pPr>
         <w:spacing w:before="0" w:after="0"/>
@@ -1516,7 +1488,6 @@
         <w:t>pip install -r requirements.txt</w:t>
       </w:r>
     </w:p>
-    <w:p/>
     <w:p>
       <w:pPr>
         <w:spacing w:line="360" w:lineRule="auto" w:after="160"/>
@@ -1530,7 +1501,6 @@
         <w:t>---</w:t>
       </w:r>
     </w:p>
-    <w:p/>
     <w:p>
       <w:r>
         <w:br w:type="page"/>
@@ -1552,7 +1522,6 @@
         <w:t>3. BUILDING BORSANEURON PLATFORM &amp; MODULES</w:t>
       </w:r>
     </w:p>
-    <w:p/>
     <w:p>
       <w:pPr>
         <w:pStyle w:val="Heading2"/>
@@ -1569,7 +1538,6 @@
         <w:t>3.1. Quantitative Data Pipeline</w:t>
       </w:r>
     </w:p>
-    <w:p/>
     <w:p>
       <w:pPr>
         <w:pStyle w:val="Heading3"/>
@@ -1599,7 +1567,6 @@
         <w:t>Technical indicators derived from price variables often exhibit extreme multicollinearity. For example, short-term and long-term moving averages (e.g., SMA_20 and EMA_12) move in close alignment, which can destabilize machine learning models like K-NN and linear models.</w:t>
       </w:r>
     </w:p>
-    <w:p/>
     <w:p>
       <w:pPr>
         <w:spacing w:line="360" w:lineRule="auto" w:after="160"/>
@@ -1613,7 +1580,6 @@
         <w:t>To resolve this, a Pearson Correlation Matrix was generated across all 30 technical indicators. Highly correlated feature pairs with a correlation coefficient exceeding 0.90 were identified:</w:t>
       </w:r>
     </w:p>
-    <w:p/>
     <w:p>
       <w:pPr>
         <w:spacing w:line="360" w:lineRule="auto" w:after="160"/>
@@ -1627,7 +1593,6 @@
         <w:t>$$|r_{ij}| &gt; 0.90$$</w:t>
       </w:r>
     </w:p>
-    <w:p/>
     <w:p>
       <w:pPr>
         <w:spacing w:line="360" w:lineRule="auto" w:after="160"/>
@@ -1641,7 +1606,6 @@
         <w:t>An upper-triangle matrix filter identified and removed these redundant variables, ensuring that only independent technical indicators were fed into our machine learning models. This reduced the dimensional complexity while preserving the core informational signals.</w:t>
       </w:r>
     </w:p>
-    <w:p/>
     <w:p>
       <w:pPr>
         <w:jc w:val="center"/>
@@ -1709,7 +1673,6 @@
         <w:t>Figure 3.1: Pearson Correlation Heatmap detailing correlation levels across the technical features.</w:t>
       </w:r>
     </w:p>
-    <w:p/>
     <w:p>
       <w:pPr>
         <w:pStyle w:val="Heading3"/>
@@ -1739,7 +1702,6 @@
         <w:t>Unsupervised learning was applied using the K-Means algorithm to partition stock states into distinct market regimes based on their normalized technical indicators. Feature standardization was executed prior to clustering:</w:t>
       </w:r>
     </w:p>
-    <w:p/>
     <w:p>
       <w:pPr>
         <w:spacing w:line="360" w:lineRule="auto" w:after="160"/>
@@ -1753,7 +1715,6 @@
         <w:t>$$z = \frac{x - \mu}{\sigma}$$</w:t>
       </w:r>
     </w:p>
-    <w:p/>
     <w:p>
       <w:pPr>
         <w:spacing w:line="360" w:lineRule="auto" w:after="160"/>
@@ -1767,7 +1728,6 @@
         <w:t>An Elbow analysis was performed to determine the optimal number of clusters. Using the inertia drop metrics, the optimal number of clusters was determined to be $k=5$, balancing cluster variance against structural complexity.</w:t>
       </w:r>
     </w:p>
-    <w:p/>
     <w:p>
       <w:pPr>
         <w:jc w:val="center"/>
@@ -1835,7 +1795,6 @@
         <w:t>Figure 3.2: Elbow method showing inertia drop rates across clusters.</w:t>
       </w:r>
     </w:p>
-    <w:p/>
     <w:p>
       <w:pPr>
         <w:spacing w:line="360" w:lineRule="auto" w:after="160"/>
@@ -1849,7 +1808,6 @@
         <w:t>To evaluate the cluster segregation and reduce high-dimensional complexity, Principal Component Analysis (PCA) was executed. PC1 and PC2 explain a total of 52.25% of overall database variance.</w:t>
       </w:r>
     </w:p>
-    <w:p/>
     <w:p>
       <w:pPr>
         <w:jc w:val="center"/>
@@ -1917,7 +1875,6 @@
         <w:t>Figure 3.3: PCA 2D scatter visualization of K-Means clusters ($k=5$).</w:t>
       </w:r>
     </w:p>
-    <w:p/>
     <w:p>
       <w:pPr>
         <w:pStyle w:val="Heading3"/>
@@ -1991,7 +1948,6 @@
         <w:t xml:space="preserve"> for direct file pushes, causing standard git push operations to time out and fail with HTTP 408 RPC errors.</w:t>
       </w:r>
     </w:p>
-    <w:p/>
     <w:p>
       <w:pPr>
         <w:spacing w:line="360" w:lineRule="auto" w:after="160"/>
@@ -2035,7 +1991,6 @@
         <w:t>.</w:t>
       </w:r>
     </w:p>
-    <w:p/>
     <w:p>
       <w:pPr>
         <w:spacing w:line="360" w:lineRule="auto" w:after="160"/>
@@ -2136,7 +2091,6 @@
         <w:t>.</w:t>
       </w:r>
     </w:p>
-    <w:p/>
     <w:p>
       <w:pPr>
         <w:pStyle w:val="Heading2"/>
@@ -2153,7 +2107,6 @@
         <w:t>3.2. Supervised Machine Learning Engines</w:t>
       </w:r>
     </w:p>
-    <w:p/>
     <w:p>
       <w:pPr>
         <w:pStyle w:val="Heading3"/>
@@ -2183,7 +2136,6 @@
         <w:t>The K-Nearest Neighbors (K-NN) classifier was implemented as a baseline instance-based model. Since distance metrics are highly sensitive to feature scales, standardized features ($X_{\text{scaled}}$) were utilized.</w:t>
       </w:r>
     </w:p>
-    <w:p/>
     <w:p>
       <w:pPr>
         <w:spacing w:line="360" w:lineRule="auto" w:after="160"/>
@@ -2197,7 +2149,6 @@
         <w:t>To optimize the neighborhood size parameter ($k$), a grid search with 5-fold cross-validation was performed:</w:t>
       </w:r>
     </w:p>
-    <w:p/>
     <w:p>
       <w:pPr>
         <w:spacing w:line="360" w:lineRule="auto" w:after="160"/>
@@ -2211,7 +2162,6 @@
         <w:t>$$\text{Search Space} = k \in \{3, 5, 7, 9, 11, 15, 21\}$$</w:t>
       </w:r>
     </w:p>
-    <w:p/>
     <w:p>
       <w:pPr>
         <w:spacing w:line="360" w:lineRule="auto" w:after="160"/>
@@ -2240,7 +2190,6 @@
         <w:t>, achieving the highest cross-validated accuracy of 54.01%.</w:t>
       </w:r>
     </w:p>
-    <w:p/>
     <w:p>
       <w:pPr>
         <w:jc w:val="center"/>
@@ -2308,7 +2257,6 @@
         <w:t>Figure 3.4: K-NN GridSearchCV accuracy values plotted against neighborhood size parameter.</w:t>
       </w:r>
     </w:p>
-    <w:p/>
     <w:p>
       <w:pPr>
         <w:pStyle w:val="Heading3"/>
@@ -2338,7 +2286,6 @@
         <w:t>The second model implemented was the Random Forest (RF) classifier. A forest of 100 estimators was trained. The Random Forest model achieved a test accuracy of 53.35% and an F1-Score of 0.6367.</w:t>
       </w:r>
     </w:p>
-    <w:p/>
     <w:p>
       <w:pPr>
         <w:spacing w:line="360" w:lineRule="auto" w:after="160"/>
@@ -2352,7 +2299,6 @@
         <w:t>Feature importances were calculated by measuring the Gini impurity decrease across all trees. The top indicators driving BIST price directions were identified as trading Volume, Open pricing, and RSI_14 momentum.</w:t>
       </w:r>
     </w:p>
-    <w:p/>
     <w:p>
       <w:pPr>
         <w:jc w:val="center"/>
@@ -2420,7 +2366,6 @@
         <w:t>Figure 3.5: Random Forest Feature Importance rating.</w:t>
       </w:r>
     </w:p>
-    <w:p/>
     <w:p>
       <w:pPr>
         <w:pStyle w:val="Heading3"/>
@@ -2548,7 +2493,6 @@
         <w:t xml:space="preserve"> 100 epochs.</w:t>
       </w:r>
     </w:p>
-    <w:p/>
     <w:p>
       <w:pPr>
         <w:spacing w:line="360" w:lineRule="auto" w:after="160"/>
@@ -2562,7 +2506,6 @@
         <w:t>The MLP neural network demonstrated high predictive performance, achieving a test accuracy of 55.68% and an F1-Score of 0.6496.</w:t>
       </w:r>
     </w:p>
-    <w:p/>
     <w:p>
       <w:pPr>
         <w:pStyle w:val="Heading3"/>
@@ -2622,7 +2565,6 @@
         <w:t>). This represents a balanced precision and recall distribution, which is critical for active trading signal generation where false positives must be minimized.</w:t>
       </w:r>
     </w:p>
-    <w:p/>
     <w:p>
       <w:pPr>
         <w:spacing w:line="360" w:lineRule="auto" w:after="160"/>
@@ -2875,7 +2817,6 @@
         <w:t xml:space="preserve"> (4.89%) — Standard deviation volatility boundaries.</w:t>
       </w:r>
     </w:p>
-    <w:p/>
     <w:p>
       <w:pPr>
         <w:jc w:val="center"/>
@@ -2943,7 +2884,6 @@
         <w:t>Figure 3.6: Performance comparison bar chart detailing Accuracy and F1-Scores.</w:t>
       </w:r>
     </w:p>
-    <w:p/>
     <w:p>
       <w:pPr>
         <w:pStyle w:val="Heading2"/>
@@ -2960,7 +2900,6 @@
         <w:t>3.3. Streamlit Workstation Interface</w:t>
       </w:r>
     </w:p>
-    <w:p/>
     <w:p>
       <w:pPr>
         <w:pStyle w:val="Heading3"/>
@@ -2990,7 +2929,6 @@
         <w:t>To bridge quantitative models with human execution, a premium web application was built using Streamlit. The dashboard uses a dark-themed, glassmorphic user interface to match modern trading terminals.</w:t>
       </w:r>
     </w:p>
-    <w:p/>
     <w:p>
       <w:pPr>
         <w:spacing w:line="360" w:lineRule="auto" w:after="160"/>
@@ -3102,7 +3040,6 @@
         <w:t xml:space="preserve"> An advanced scanner that analyzes historical price data to flag classical chart patterns.</w:t>
       </w:r>
     </w:p>
-    <w:p/>
     <w:p>
       <w:pPr>
         <w:jc w:val="center"/>
@@ -3170,7 +3107,6 @@
         <w:t>Figure 3.7: BorsaNeuron interactive platform welcome dashboard UI.</w:t>
       </w:r>
     </w:p>
-    <w:p/>
     <w:p>
       <w:pPr>
         <w:pStyle w:val="Heading3"/>
@@ -3214,7 +3150,6 @@
         <w:t>), the serializations are loaded into memory and yfinance handles live price streams:</w:t>
       </w:r>
     </w:p>
-    <w:p/>
     <w:p>
       <w:pPr>
         <w:spacing w:before="0" w:after="0"/>
@@ -3423,7 +3358,6 @@
         <w:t xml:space="preserve">    return prediction, probability</w:t>
       </w:r>
     </w:p>
-    <w:p/>
     <w:p>
       <w:pPr>
         <w:spacing w:line="360" w:lineRule="auto" w:after="160"/>
@@ -3437,7 +3371,6 @@
         <w:t>This pipeline allows the web dashboard to instantly generate active market predictions for any BIST stock.</w:t>
       </w:r>
     </w:p>
-    <w:p/>
     <w:p>
       <w:pPr>
         <w:jc w:val="center"/>
@@ -3505,7 +3438,6 @@
         <w:t>Figure 3.8: Real-time stock forecast panel UI.</w:t>
       </w:r>
     </w:p>
-    <w:p/>
     <w:p>
       <w:pPr>
         <w:pStyle w:val="Heading3"/>
@@ -3565,7 +3497,6 @@
         <w:t xml:space="preserve"> under the AI strategy:</w:t>
       </w:r>
     </w:p>
-    <w:p/>
     <w:p>
       <w:pPr>
         <w:spacing w:line="360" w:lineRule="auto" w:after="160"/>
@@ -3579,7 +3510,6 @@
         <w:t>$$\text{Win Rate} = \frac{\text{Correct Bullish Forecasts}}{\text{Total Bullish Signals}} \times 100$$</w:t>
       </w:r>
     </w:p>
-    <w:p/>
     <w:p>
       <w:pPr>
         <w:spacing w:line="360" w:lineRule="auto" w:after="160"/>
@@ -3593,7 +3523,6 @@
         <w:t>The system displays this as a dedicated decision factor. If the stock has a history of high compliance (Win Rate &gt; 60%), it outputs a strong buy confirmation. If the stock is highly volatile or erratic (Win Rate &lt; 48%), it issues an active risk warning.</w:t>
       </w:r>
     </w:p>
-    <w:p/>
     <w:p>
       <w:pPr>
         <w:pStyle w:val="Heading3"/>
@@ -3623,7 +3552,6 @@
         <w:t>The terminal groups stocks into sectors (Holding, Banking, Industrial, Energy, Logistics, etc.) and compares the queried stock's live metrics against the sector's historical averages. This provides direct macro-context to traders.</w:t>
       </w:r>
     </w:p>
-    <w:p/>
     <w:p>
       <w:pPr>
         <w:pStyle w:val="Heading3"/>
@@ -3653,7 +3581,6 @@
         <w:t>BorsaNeuron renders a Plotly Candlestick chart overlaid with Bollinger Bands and moving averages. Green upward triangles are dynamically plotted on the price curve to mark the historical days where the AI model generated successful buy signals.</w:t>
       </w:r>
     </w:p>
-    <w:p/>
     <w:p>
       <w:pPr>
         <w:pStyle w:val="Heading3"/>
@@ -3698,7 +3625,6 @@
         <w:t xml:space="preserve"> over the last 1 year, starting with a hypothetical 100,000 TL capital.</w:t>
       </w:r>
     </w:p>
-    <w:p/>
     <w:p>
       <w:pPr>
         <w:jc w:val="center"/>
@@ -3766,7 +3692,6 @@
         <w:t>Figure 3.9: What-If Scenario UI, displaying dynamic simulation sliders.</w:t>
       </w:r>
     </w:p>
-    <w:p/>
     <w:p>
       <w:pPr>
         <w:jc w:val="center"/>
@@ -3834,7 +3759,6 @@
         <w:t>Figure 3.10: K-Means cluster profile density analysis.</w:t>
       </w:r>
     </w:p>
-    <w:p/>
     <w:p>
       <w:pPr>
         <w:jc w:val="center"/>
@@ -3902,7 +3826,6 @@
         <w:t>Figure 3.11: Live Prophet price path forecast interface.</w:t>
       </w:r>
     </w:p>
-    <w:p/>
     <w:p>
       <w:pPr>
         <w:jc w:val="center"/>
@@ -3970,7 +3893,6 @@
         <w:t>Figure 3.12: Backtesting performance charting comparing active BorsaNeuron prediction signals.</w:t>
       </w:r>
     </w:p>
-    <w:p/>
     <w:p>
       <w:pPr>
         <w:pStyle w:val="Heading2"/>
@@ -3987,7 +3909,6 @@
         <w:t>3.4. Automated Geometric Pattern Recognition Engine</w:t>
       </w:r>
     </w:p>
-    <w:p/>
     <w:p>
       <w:pPr>
         <w:pStyle w:val="Heading3"/>
@@ -4031,7 +3952,6 @@
         <w:t>. The scan uses raw price swing points calculated via a ZigZag indicator. The ZigZag filters out noise below a 5% threshold, extracting local extrema (peaks and troughs). Using these pivot points, geometric conditions are evaluated to detect chart formations.</w:t>
       </w:r>
     </w:p>
-    <w:p/>
     <w:p>
       <w:pPr>
         <w:pStyle w:val="Heading3"/>
@@ -4142,7 +4062,6 @@
         <w:t>A break below the neckline triggers a bearish reversal warning.</w:t>
       </w:r>
     </w:p>
-    <w:p/>
     <w:p>
       <w:pPr>
         <w:pStyle w:val="Heading3"/>
@@ -4234,7 +4153,6 @@
         <w:t xml:space="preserve"> Identified by identifying a strong, vertical price movement (the flagpole) followed by a narrow, parallel consolidation range (the flag). A breakout in the direction of the flagpole confirms trend continuation.</w:t>
       </w:r>
     </w:p>
-    <w:p/>
     <w:p>
       <w:pPr>
         <w:pStyle w:val="Heading3"/>
@@ -4371,7 +4289,6 @@
         <w:t>$$\text{Close} &lt; L_1$$</w:t>
       </w:r>
     </w:p>
-    <w:p/>
     <w:p>
       <w:pPr>
         <w:spacing w:line="360" w:lineRule="auto" w:after="160"/>
@@ -4385,7 +4302,6 @@
         <w:t>---</w:t>
       </w:r>
     </w:p>
-    <w:p/>
     <w:p>
       <w:r>
         <w:br w:type="page"/>
@@ -4407,7 +4323,6 @@
         <w:t>4. DEPLOYING PROJECT</w:t>
       </w:r>
     </w:p>
-    <w:p/>
     <w:p>
       <w:pPr>
         <w:spacing w:line="360" w:lineRule="auto" w:after="160"/>
@@ -4421,7 +4336,6 @@
         <w:t>Following modeling and dashboard construction, BorsaNeuron was containerized using Docker to ensure consistent execution across local developer workstations and cloud production servers.</w:t>
       </w:r>
     </w:p>
-    <w:p/>
     <w:p>
       <w:pPr>
         <w:pStyle w:val="Heading2"/>
@@ -4465,7 +4379,6 @@
         <w:t xml:space="preserve"> was created:</w:t>
       </w:r>
     </w:p>
-    <w:p/>
     <w:p>
       <w:pPr>
         <w:spacing w:before="0" w:after="0"/>
@@ -4706,7 +4619,6 @@
         <w:t>ENTRYPOINT ["streamlit", "run", "src/app.py", "--server.port=8501", "--server.address=0.0.0.0"]</w:t>
       </w:r>
     </w:p>
-    <w:p/>
     <w:p>
       <w:pPr>
         <w:pStyle w:val="Heading2"/>
@@ -4736,7 +4648,6 @@
         <w:t>To build the image and spin up the production container, the following commands are executed:</w:t>
       </w:r>
     </w:p>
-    <w:p/>
     <w:p>
       <w:pPr>
         <w:spacing w:before="0" w:after="0"/>
@@ -4811,7 +4722,6 @@
         <w:t>docker run -d -p 80:8501 --name borsaneuron-prod borsaneuron-app:latest</w:t>
       </w:r>
     </w:p>
-    <w:p/>
     <w:p>
       <w:pPr>
         <w:spacing w:line="360" w:lineRule="auto" w:after="160"/>
@@ -4825,7 +4735,6 @@
         <w:t>This maps port 8501 of the Streamlit application container directly to port 80 of the host machine, making BorsaNeuron accessible via standard HTTP.</w:t>
       </w:r>
     </w:p>
-    <w:p/>
     <w:p>
       <w:pPr>
         <w:spacing w:line="360" w:lineRule="auto" w:after="160"/>
@@ -4839,7 +4748,6 @@
         <w:t>---</w:t>
       </w:r>
     </w:p>
-    <w:p/>
     <w:p>
       <w:r>
         <w:br w:type="page"/>
@@ -4861,7 +4769,6 @@
         <w:t>5. FILE HIERARCHY</w:t>
       </w:r>
     </w:p>
-    <w:p/>
     <w:p>
       <w:pPr>
         <w:spacing w:line="360" w:lineRule="auto" w:after="160"/>
@@ -4875,7 +4782,6 @@
         <w:t>The complete directory tree of the BorsaNeuron graduation project is structured as follows, separating offline modeling from the online Streamlit interface:</w:t>
       </w:r>
     </w:p>
-    <w:p/>
     <w:p>
       <w:pPr>
         <w:spacing w:before="0" w:after="0"/>
@@ -5176,7 +5082,6 @@
         <w:t xml:space="preserve">    └── test_features.py              # Unit tests for technical indicator vectors</w:t>
       </w:r>
     </w:p>
-    <w:p/>
     <w:p>
       <w:pPr>
         <w:spacing w:line="360" w:lineRule="auto" w:after="160"/>
@@ -5190,7 +5095,6 @@
         <w:t>---</w:t>
       </w:r>
     </w:p>
-    <w:p/>
     <w:p>
       <w:r>
         <w:br w:type="page"/>
@@ -5212,7 +5116,6 @@
         <w:t>TECH STACK</w:t>
       </w:r>
     </w:p>
-    <w:p/>
     <w:tbl>
       <w:tblPr>
         <w:tblW w:type="auto" w:w="0"/>
@@ -5984,7 +5887,6 @@
         <w:t>---</w:t>
       </w:r>
     </w:p>
-    <w:p/>
     <w:p>
       <w:r>
         <w:br w:type="page"/>
@@ -6006,7 +5908,6 @@
         <w:t>REFERENCES</w:t>
       </w:r>
     </w:p>
-    <w:p/>
     <w:p>
       <w:pPr>
         <w:pStyle w:val="ListBullet"/>

</xml_diff>